<commit_message>
Update base CV with AI tools and add Solix EAI CV
</commit_message>
<xml_diff>
--- a/Base/Pedro_Gutierrez_CV.docx
+++ b/Base/Pedro_Gutierrez_CV.docx
@@ -29,7 +29,7 @@
           <w:color w:val="404040"/>
           <w:sz w:val="19"/>
         </w:rPr>
-        <w:t>Data Engineer | Snowflake Developer | SQL Server, dbt, Power BI, ETL &amp; Data Warehousing</w:t>
+        <w:t>Data Engineer | Snowflake Developer | SQL Server, dbt, Snowflake Cortex, AI Tools, Power BI, ETL &amp; Data Warehousing</w:t>
       </w:r>
     </w:p>
     <w:p>
@@ -72,7 +72,7 @@
           <w:rFonts w:ascii="Aptos" w:hAnsi="Aptos"/>
           <w:sz w:val="18"/>
         </w:rPr>
-        <w:t>Data Engineer, Snowflake Developer, and SQL Server specialist with 15+ years of experience designing, building, optimizing, and maintaining data solutions across ETL/ELT, data warehousing, BI, reporting, database development, and data quality. Hands-on experience with Snowflake SQL, dbt models, SQL Server, SSIS, SSAS, SSRS, Power BI, Python, PowerShell, Azure, Snowflake, PostgreSQL, MySQL, Salesforce integrations, and Excel. Experienced migrating reporting/business logic into SQL, building silver and gold layer models, optimizing warehouse processing performance, creating reusable data models, and transforming complex datasets into reliable analytics-ready assets for reporting and decision-making.</w:t>
+        <w:t>Data Engineer, Snowflake Developer, and SQL Server specialist with 15+ years of experience designing, building, optimizing, and maintaining data solutions across ETL/ELT, data warehousing, BI, reporting, database development, data quality, and AI-assisted analytics workflows. Hands-on experience with Snowflake SQL, dbt models, Snowflake Cortex, MetricFlow semantic layer work, AI-assisted development tools including Cursor and PR review bots, SQL Server, SSIS, SSAS, SSRS, Power BI, Python, PowerShell, Azure, PostgreSQL, MySQL, Salesforce integrations, and Excel. Experienced migrating reporting/business logic into SQL, building silver and gold layer models, optimizing warehouse processing performance, creating reusable data models, and transforming complex datasets into reliable analytics-ready assets for reporting and decision-making.</w:t>
       </w:r>
     </w:p>
     <w:p>
@@ -339,7 +339,7 @@
           <w:rFonts w:ascii="Aptos" w:hAnsi="Aptos"/>
           <w:sz w:val="18"/>
         </w:rPr>
-        <w:t>Snowflake / dbt: Snowflake SQL, dbt models, silver and gold layers, metric flow support, DWH modeling, Kimball practices</w:t>
+        <w:t>Snowflake / dbt / AI: Snowflake SQL, dbt models, silver and gold layers, MetricFlow semantic layer support, Snowflake Cortex, DWH modeling, Kimball practices</w:t>
       </w:r>
     </w:p>
     <w:p>
@@ -395,7 +395,7 @@
           <w:rFonts w:ascii="Aptos" w:hAnsi="Aptos"/>
           <w:sz w:val="18"/>
         </w:rPr>
-        <w:t>Programming &amp; Automation: Python, Pandas, NumPy, Matplotlib, PowerShell, C# code migration to SQL logic</w:t>
+        <w:t>Programming, Automation &amp; AI Tools: Python, Pandas, NumPy, Matplotlib, PowerShell, Cursor, AI-assisted PR review bots, C# code migration to SQL logic</w:t>
       </w:r>
     </w:p>
     <w:p>
@@ -423,7 +423,7 @@
           <w:rFonts w:ascii="Aptos" w:hAnsi="Aptos"/>
           <w:sz w:val="18"/>
         </w:rPr>
-        <w:t>Business Delivery: stakeholder collaboration, requirements translation, reporting datasets, actionable insights</w:t>
+        <w:t>Business Delivery: stakeholder collaboration, requirements translation, reporting datasets, semantic layer support, actionable insights</w:t>
       </w:r>
     </w:p>
     <w:p>
@@ -538,7 +538,7 @@
           <w:rFonts w:ascii="Aptos" w:hAnsi="Aptos"/>
           <w:sz w:val="18"/>
         </w:rPr>
-        <w:t>Support dbt MetricFlow work by helping create and organize metrics for different datasets, improving consistency and usability of analytical definitions.</w:t>
+        <w:t>Support the development of the MetricFlow semantic layer, using Snowflake Cortex over the last 6 months to support AI-enabled analytics workflows, metric organization, and consistency of analytical definitions.</w:t>
       </w:r>
     </w:p>
     <w:p>
@@ -551,7 +551,7 @@
           <w:b/>
           <w:sz w:val="17"/>
         </w:rPr>
-        <w:t xml:space="preserve">Technologies: </w:t>
+        <w:t>Technologies: Snowflake, Snowflake SQL, Snowflake Cortex, dbt, MetricFlow, semantic layer, DWH, Kimball, SQL, C# logic migration, Cursor, AI-assisted PR review bot</w:t>
       </w:r>
       <w:r>
         <w:rPr>
@@ -559,7 +559,6 @@
           <w:color w:val="4C4C4C"/>
           <w:sz w:val="17"/>
         </w:rPr>
-        <w:t>Snowflake, Snowflake SQL, dbt, MetricFlow, DWH, Kimball, SQL, C# logic migration</w:t>
       </w:r>
     </w:p>
     <w:p>

</xml_diff>